<commit_message>
docs: clarify control lane allocations, define correlation identifiers, explicitly state record-integrity requirements, and update manuscript meta-information.
</commit_message>
<xml_diff>
--- a/output/docx/实体审理前.docx
+++ b/output/docx/实体审理前.docx
@@ -105,10 +105,10 @@
     <w:p>
       <w:pPr>
         <w:pStyle w:val="Abstract"/>
-        <w:spacing w:before="0" w:after="0" w:line="320" w:lineRule="exact"/>
+        <w:keepLines/>
+        <w:spacing w:before="0" w:after="0" w:line="272" w:lineRule="exact"/>
         <w:ind w:firstLine="0"/>
         <w:jc w:val="both"/>
-        <w:keepLines/>
       </w:pPr>
       <w:r>
         <w:rPr>
@@ -126,10 +126,10 @@
     <w:p>
       <w:pPr>
         <w:pStyle w:val="Abstract"/>
-        <w:spacing w:before="0" w:after="0" w:line="320" w:lineRule="exact"/>
+        <w:keepLines/>
+        <w:spacing w:before="0" w:after="0" w:line="272" w:lineRule="exact"/>
         <w:ind w:firstLine="0"/>
         <w:jc w:val="both"/>
-        <w:keepLines/>
       </w:pPr>
       <w:r>
         <w:rPr>
@@ -147,10 +147,10 @@
     <w:p>
       <w:pPr>
         <w:pStyle w:val="Abstract"/>
-        <w:spacing w:before="0" w:after="0" w:line="320" w:lineRule="exact"/>
+        <w:keepLines/>
+        <w:spacing w:before="0" w:after="0" w:line="272" w:lineRule="exact"/>
         <w:ind w:firstLine="0"/>
         <w:jc w:val="both"/>
-        <w:keepLines/>
       </w:pPr>
       <w:r>
         <w:rPr>
@@ -240,10 +240,10 @@
     <w:p>
       <w:pPr>
         <w:pStyle w:val="Abstract"/>
-        <w:spacing w:before="0" w:after="0" w:line="320" w:lineRule="exact"/>
+        <w:keepLines/>
+        <w:spacing w:before="0" w:after="0" w:line="272" w:lineRule="exact"/>
         <w:ind w:firstLine="0"/>
         <w:jc w:val="both"/>
-        <w:keepLines/>
       </w:pPr>
       <w:r>
         <w:rPr>

</xml_diff>